<commit_message>
Fix Contract Chat recovery and model downloads
</commit_message>
<xml_diff>
--- a/docs/AI_Enabled_Contracts_Lab_User_Guide.docx
+++ b/docs/AI_Enabled_Contracts_Lab_User_Guide.docx
@@ -2854,7 +2854,7 @@
             <w:color w:val="2E74B5"/>
             <w:u w:val="single"/>
           </w:rPr>
-          <w:t>16.6 Consider public visibility separately</w:t>
+          <w:t>16.6 Download and validate Contra v2</w:t>
         </w:r>
       </w:hyperlink>
       <w:r>
@@ -2862,6 +2862,29 @@
       </w:r>
       <w:r>
         <w:t>37</w:t>
+      </w:r>
+    </w:p>
+    <w:p>
+      <w:pPr>
+        <w:pStyle w:val="TOCEntry2"/>
+        <w:tabs>
+          <w:tab w:pos="9288" w:val="right" w:leader="dot"/>
+        </w:tabs>
+      </w:pPr>
+      <w:hyperlink w:anchor="guide_sec_116">
+        <w:r>
+          <w:rPr>
+            <w:color w:val="2E74B5"/>
+            <w:u w:val="single"/>
+          </w:rPr>
+          <w:t>16.7 Consider public visibility separately</w:t>
+        </w:r>
+      </w:hyperlink>
+      <w:r>
+        <w:tab/>
+      </w:r>
+      <w:r>
+        <w:t>39</w:t>
       </w:r>
     </w:p>
     <w:p>
@@ -2871,7 +2894,7 @@
           <w:tab w:pos="9288" w:val="right" w:leader="dot"/>
         </w:tabs>
       </w:pPr>
-      <w:hyperlink w:anchor="guide_sec_116">
+      <w:hyperlink w:anchor="guide_sec_117">
         <w:r>
           <w:rPr>
             <w:color w:val="2E74B5"/>
@@ -2884,7 +2907,7 @@
         <w:tab/>
       </w:r>
       <w:r>
-        <w:t>37</w:t>
+        <w:t>39</w:t>
       </w:r>
     </w:p>
     <w:p>
@@ -2894,7 +2917,7 @@
           <w:tab w:pos="9288" w:val="right" w:leader="dot"/>
         </w:tabs>
       </w:pPr>
-      <w:hyperlink w:anchor="guide_sec_117">
+      <w:hyperlink w:anchor="guide_sec_118">
         <w:r>
           <w:rPr>
             <w:color w:val="2E74B5"/>
@@ -2907,7 +2930,7 @@
         <w:tab/>
       </w:r>
       <w:r>
-        <w:t>37</w:t>
+        <w:t>39</w:t>
       </w:r>
     </w:p>
     <w:p>
@@ -2917,7 +2940,7 @@
           <w:tab w:pos="9288" w:val="right" w:leader="dot"/>
         </w:tabs>
       </w:pPr>
-      <w:hyperlink w:anchor="guide_sec_118">
+      <w:hyperlink w:anchor="guide_sec_119">
         <w:r>
           <w:rPr>
             <w:color w:val="2E74B5"/>
@@ -2930,7 +2953,7 @@
         <w:tab/>
       </w:r>
       <w:r>
-        <w:t>38</w:t>
+        <w:t>40</w:t>
       </w:r>
     </w:p>
     <w:p>
@@ -2940,7 +2963,7 @@
           <w:tab w:pos="9288" w:val="right" w:leader="dot"/>
         </w:tabs>
       </w:pPr>
-      <w:hyperlink w:anchor="guide_sec_119">
+      <w:hyperlink w:anchor="guide_sec_120">
         <w:r>
           <w:rPr>
             <w:color w:val="2E74B5"/>
@@ -2953,7 +2976,7 @@
         <w:tab/>
       </w:r>
       <w:r>
-        <w:t>39</w:t>
+        <w:t>41</w:t>
       </w:r>
     </w:p>
     <w:p>
@@ -2963,7 +2986,7 @@
           <w:tab w:pos="9288" w:val="right" w:leader="dot"/>
         </w:tabs>
       </w:pPr>
-      <w:hyperlink w:anchor="guide_sec_120">
+      <w:hyperlink w:anchor="guide_sec_121">
         <w:r>
           <w:rPr>
             <w:color w:val="2E74B5"/>
@@ -2976,7 +2999,7 @@
         <w:tab/>
       </w:r>
       <w:r>
-        <w:t>40</w:t>
+        <w:t>42</w:t>
       </w:r>
     </w:p>
     <w:p>
@@ -15456,9 +15479,380 @@
         <w:pStyle w:val="Heading2"/>
       </w:pPr>
       <w:r>
-        <w:t>16.6 Consider public visibility separately</w:t>
+        <w:t>16.6 Download and validate Contra v2</w:t>
       </w:r>
       <w:bookmarkEnd w:id="214"/>
+    </w:p>
+    <w:p>
+      <w:r>
+        <w:t>The repository must already exist, and the signed-in account must have read access while it remains private. Authenticate outside Streamlit and run the project downloader:</w:t>
+      </w:r>
+    </w:p>
+    <w:p>
+      <w:pPr>
+        <w:pStyle w:val="CodeBlock"/>
+        <w:shd w:fill="F4F6F7"/>
+        <w:pBdr>
+          <w:left w:val="single" w:sz="18" w:space="8" w:color="C9D3DD"/>
+        </w:pBdr>
+      </w:pPr>
+      <w:r>
+        <w:rPr>
+          <w:rFonts w:ascii="Consolas" w:hAnsi="Consolas"/>
+          <w:sz w:val="17"/>
+        </w:rPr>
+        <w:t>hf auth login</w:t>
+      </w:r>
+      <w:r>
+        <w:br/>
+      </w:r>
+      <w:r>
+        <w:rPr>
+          <w:rFonts w:ascii="Consolas" w:hAnsi="Consolas"/>
+          <w:sz w:val="17"/>
+        </w:rPr>
+        <w:t>hf auth whoami</w:t>
+      </w:r>
+      <w:r>
+        <w:br/>
+      </w:r>
+      <w:r>
+        <w:rPr>
+          <w:rFonts w:ascii="Consolas" w:hAnsi="Consolas"/>
+          <w:sz w:val="17"/>
+        </w:rPr>
+        <w:t>.\.venv\Scripts\python.exe tools\download_huggingface_model.py</w:t>
+      </w:r>
+    </w:p>
+    <w:p>
+      <w:r>
+        <w:t xml:space="preserve">The default output is the Git-ignored </w:t>
+      </w:r>
+      <w:r>
+        <w:rPr>
+          <w:rFonts w:ascii="Consolas" w:hAnsi="Consolas"/>
+          <w:color w:val="1F4D78"/>
+          <w:sz w:val="18"/>
+        </w:rPr>
+        <w:t>artifacts/models/contra-v2/</w:t>
+      </w:r>
+      <w:r>
+        <w:t xml:space="preserve"> directory. The downloader uses the credential saved by the official Hugging Face CLI and does not accept a token argument. It:</w:t>
+      </w:r>
+    </w:p>
+    <w:p>
+      <w:pPr>
+        <w:pStyle w:val="ListBullet"/>
+      </w:pPr>
+      <w:r>
+        <w:t>checks that at least 1 GB of disk space is available;</w:t>
+      </w:r>
+    </w:p>
+    <w:p>
+      <w:pPr>
+        <w:pStyle w:val="ListBullet"/>
+      </w:pPr>
+      <w:r>
+        <w:t>downloads only the seven reviewed Contra release files;</w:t>
+      </w:r>
+    </w:p>
+    <w:p>
+      <w:pPr>
+        <w:pStyle w:val="ListBullet"/>
+      </w:pPr>
+      <w:r>
+        <w:t>validates that required files are present and nonempty;</w:t>
+      </w:r>
+    </w:p>
+    <w:p>
+      <w:pPr>
+        <w:pStyle w:val="ListBullet"/>
+      </w:pPr>
+      <w:r>
+        <w:t xml:space="preserve">confirms that </w:t>
+      </w:r>
+      <w:r>
+        <w:rPr>
+          <w:rFonts w:ascii="Consolas" w:hAnsi="Consolas"/>
+          <w:color w:val="1F4D78"/>
+          <w:sz w:val="18"/>
+        </w:rPr>
+        <w:t>id2label</w:t>
+      </w:r>
+      <w:r>
+        <w:t xml:space="preserve"> and </w:t>
+      </w:r>
+      <w:r>
+        <w:rPr>
+          <w:rFonts w:ascii="Consolas" w:hAnsi="Consolas"/>
+          <w:color w:val="1F4D78"/>
+          <w:sz w:val="18"/>
+        </w:rPr>
+        <w:t>label2id</w:t>
+      </w:r>
+      <w:r>
+        <w:t xml:space="preserve"> contain 41 inverse mappings; and</w:t>
+      </w:r>
+    </w:p>
+    <w:p>
+      <w:pPr>
+        <w:pStyle w:val="ListBullet"/>
+      </w:pPr>
+      <w:r>
+        <w:t>loads the tokenizer and safetensors weights from local files and confirms 41 inference logits.</w:t>
+      </w:r>
+    </w:p>
+    <w:p>
+      <w:r>
+        <w:t>Pin a release tag or full commit hash so later runs obtain the same files:</w:t>
+      </w:r>
+    </w:p>
+    <w:p>
+      <w:pPr>
+        <w:pStyle w:val="CodeBlock"/>
+        <w:shd w:fill="F4F6F7"/>
+        <w:pBdr>
+          <w:left w:val="single" w:sz="18" w:space="8" w:color="C9D3DD"/>
+        </w:pBdr>
+      </w:pPr>
+      <w:r>
+        <w:rPr>
+          <w:rFonts w:ascii="Consolas" w:hAnsi="Consolas"/>
+          <w:sz w:val="17"/>
+        </w:rPr>
+        <w:t>.\.venv\Scripts\python.exe tools\download_huggingface_model.py `</w:t>
+      </w:r>
+      <w:r>
+        <w:br/>
+      </w:r>
+      <w:r>
+        <w:rPr>
+          <w:rFonts w:ascii="Consolas" w:hAnsi="Consolas"/>
+          <w:sz w:val="17"/>
+        </w:rPr>
+        <w:t xml:space="preserve">  --revision FULL_COMMIT_HASH `</w:t>
+      </w:r>
+      <w:r>
+        <w:br/>
+      </w:r>
+      <w:r>
+        <w:rPr>
+          <w:rFonts w:ascii="Consolas" w:hAnsi="Consolas"/>
+          <w:sz w:val="17"/>
+        </w:rPr>
+        <w:t xml:space="preserve">  --output artifacts\models\contra-v2</w:t>
+      </w:r>
+    </w:p>
+    <w:p>
+      <w:r>
+        <w:t xml:space="preserve">Use </w:t>
+      </w:r>
+      <w:r>
+        <w:rPr>
+          <w:rFonts w:ascii="Consolas" w:hAnsi="Consolas"/>
+          <w:color w:val="1F4D78"/>
+          <w:sz w:val="18"/>
+        </w:rPr>
+        <w:t>--skip-inference</w:t>
+      </w:r>
+      <w:r>
+        <w:t xml:space="preserve"> only when packages or memory are temporarily unavailable; file and configuration validation still runs. Use </w:t>
+      </w:r>
+      <w:r>
+        <w:rPr>
+          <w:rFonts w:ascii="Consolas" w:hAnsi="Consolas"/>
+          <w:color w:val="1F4D78"/>
+          <w:sz w:val="18"/>
+        </w:rPr>
+        <w:t>--force-download</w:t>
+      </w:r>
+      <w:r>
+        <w:t xml:space="preserve"> to refresh files. An inaccessible private repository produces a message directing the user to </w:t>
+      </w:r>
+      <w:r>
+        <w:rPr>
+          <w:rFonts w:ascii="Consolas" w:hAnsi="Consolas"/>
+          <w:color w:val="1F4D78"/>
+          <w:sz w:val="18"/>
+        </w:rPr>
+        <w:t>hf auth login</w:t>
+      </w:r>
+      <w:r>
+        <w:t>; a bad revision, incomplete bundle, invalid mapping, or low-disk condition fails explicitly.</w:t>
+      </w:r>
+    </w:p>
+    <w:p>
+      <w:r>
+        <w:t>The official CLI can download the repository without the project-specific checks:</w:t>
+      </w:r>
+    </w:p>
+    <w:p>
+      <w:pPr>
+        <w:pStyle w:val="CodeBlock"/>
+        <w:shd w:fill="F4F6F7"/>
+        <w:pBdr>
+          <w:left w:val="single" w:sz="18" w:space="8" w:color="C9D3DD"/>
+        </w:pBdr>
+      </w:pPr>
+      <w:r>
+        <w:rPr>
+          <w:rFonts w:ascii="Consolas" w:hAnsi="Consolas"/>
+          <w:sz w:val="17"/>
+        </w:rPr>
+        <w:t>hf download rjaloudi/contra-contracts-bert-cuad-clause-classifier `</w:t>
+      </w:r>
+      <w:r>
+        <w:br/>
+      </w:r>
+      <w:r>
+        <w:rPr>
+          <w:rFonts w:ascii="Consolas" w:hAnsi="Consolas"/>
+          <w:sz w:val="17"/>
+        </w:rPr>
+        <w:t xml:space="preserve">  --local-dir artifacts\models\contra-v2</w:t>
+      </w:r>
+    </w:p>
+    <w:p>
+      <w:r>
+        <w:t xml:space="preserve">After </w:t>
+      </w:r>
+      <w:r>
+        <w:rPr>
+          <w:rFonts w:ascii="Consolas" w:hAnsi="Consolas"/>
+          <w:color w:val="1F4D78"/>
+          <w:sz w:val="18"/>
+        </w:rPr>
+        <w:t>hf auth login</w:t>
+      </w:r>
+      <w:r>
+        <w:t>, Transformers can also use the stored credential and download automatically:</w:t>
+      </w:r>
+    </w:p>
+    <w:p>
+      <w:pPr>
+        <w:pStyle w:val="CodeBlock"/>
+        <w:shd w:fill="F4F6F7"/>
+        <w:pBdr>
+          <w:left w:val="single" w:sz="18" w:space="8" w:color="C9D3DD"/>
+        </w:pBdr>
+      </w:pPr>
+      <w:r>
+        <w:rPr>
+          <w:rFonts w:ascii="Consolas" w:hAnsi="Consolas"/>
+          <w:sz w:val="17"/>
+        </w:rPr>
+        <w:t>from transformers import AutoModelForSequenceClassification, AutoTokenizer</w:t>
+      </w:r>
+      <w:r>
+        <w:br/>
+      </w:r>
+      <w:r>
+        <w:rPr>
+          <w:rFonts w:ascii="Consolas" w:hAnsi="Consolas"/>
+          <w:sz w:val="17"/>
+        </w:rPr>
+        <w:t xml:space="preserve"> </w:t>
+      </w:r>
+      <w:r>
+        <w:br/>
+      </w:r>
+      <w:r>
+        <w:rPr>
+          <w:rFonts w:ascii="Consolas" w:hAnsi="Consolas"/>
+          <w:sz w:val="17"/>
+        </w:rPr>
+        <w:t>repo_id = "rjaloudi/contra-contracts-bert-cuad-clause-classifier"</w:t>
+      </w:r>
+      <w:r>
+        <w:br/>
+      </w:r>
+      <w:r>
+        <w:rPr>
+          <w:rFonts w:ascii="Consolas" w:hAnsi="Consolas"/>
+          <w:sz w:val="17"/>
+        </w:rPr>
+        <w:t>tokenizer = AutoTokenizer.from_pretrained(repo_id)</w:t>
+      </w:r>
+      <w:r>
+        <w:br/>
+      </w:r>
+      <w:r>
+        <w:rPr>
+          <w:rFonts w:ascii="Consolas" w:hAnsi="Consolas"/>
+          <w:sz w:val="17"/>
+        </w:rPr>
+        <w:t>model = AutoModelForSequenceClassification.from_pretrained(repo_id)</w:t>
+      </w:r>
+    </w:p>
+    <w:p>
+      <w:r>
+        <w:t xml:space="preserve">Hugging Face documents </w:t>
+      </w:r>
+      <w:r>
+        <w:rPr>
+          <w:rFonts w:ascii="Consolas" w:hAnsi="Consolas"/>
+          <w:color w:val="1F4D78"/>
+          <w:sz w:val="18"/>
+        </w:rPr>
+        <w:t>snapshot_download</w:t>
+      </w:r>
+      <w:r>
+        <w:t xml:space="preserve">, revision selection, filtering, and local directories at </w:t>
+      </w:r>
+      <w:r>
+        <w:rPr>
+          <w:rFonts w:ascii="Consolas" w:hAnsi="Consolas"/>
+          <w:color w:val="1F4D78"/>
+          <w:sz w:val="18"/>
+        </w:rPr>
+        <w:t>https://huggingface.co/docs/huggingface_hub/en/guides/download</w:t>
+      </w:r>
+      <w:r>
+        <w:t xml:space="preserve">. Never paste a token into a script, command, notebook, Streamlit field, screenshot, or chat. For repeatable offline use, point </w:t>
+      </w:r>
+      <w:r>
+        <w:rPr>
+          <w:rFonts w:ascii="Consolas" w:hAnsi="Consolas"/>
+          <w:color w:val="1F4D78"/>
+          <w:sz w:val="18"/>
+        </w:rPr>
+        <w:t>from_pretrained</w:t>
+      </w:r>
+      <w:r>
+        <w:t xml:space="preserve"> to </w:t>
+      </w:r>
+      <w:r>
+        <w:rPr>
+          <w:rFonts w:ascii="Consolas" w:hAnsi="Consolas"/>
+          <w:color w:val="1F4D78"/>
+          <w:sz w:val="18"/>
+        </w:rPr>
+        <w:t>artifacts/models/contra-v2/</w:t>
+      </w:r>
+      <w:r>
+        <w:t xml:space="preserve"> and set </w:t>
+      </w:r>
+      <w:r>
+        <w:rPr>
+          <w:rFonts w:ascii="Consolas" w:hAnsi="Consolas"/>
+          <w:color w:val="1F4D78"/>
+          <w:sz w:val="18"/>
+        </w:rPr>
+        <w:t>local_files_only=True</w:t>
+      </w:r>
+      <w:r>
+        <w:t>.</w:t>
+      </w:r>
+    </w:p>
+    <w:p>
+      <w:bookmarkStart w:id="215" w:name="guide_sec_116"/>
+      <w:pPr>
+        <w:pStyle w:val="Heading2"/>
+      </w:pPr>
+      <w:r>
+        <w:t>16.7 Consider public visibility separately</w:t>
+      </w:r>
+      <w:bookmarkEnd w:id="215"/>
     </w:p>
     <w:p>
       <w:r>
@@ -15477,24 +15871,24 @@
       </w:r>
     </w:p>
     <w:p>
-      <w:bookmarkStart w:id="215" w:name="guide_sec_116"/>
+      <w:bookmarkStart w:id="216" w:name="guide_sec_117"/>
       <w:pPr>
         <w:pStyle w:val="Heading1"/>
       </w:pPr>
       <w:r>
         <w:t>17. Command and configuration reference</w:t>
       </w:r>
-      <w:bookmarkEnd w:id="215"/>
-    </w:p>
-    <w:p>
-      <w:bookmarkStart w:id="216" w:name="guide_sec_117"/>
+      <w:bookmarkEnd w:id="216"/>
+    </w:p>
+    <w:p>
+      <w:bookmarkStart w:id="217" w:name="guide_sec_118"/>
       <w:pPr>
         <w:pStyle w:val="Heading2"/>
       </w:pPr>
       <w:r>
         <w:t>17.1 Command summary</w:t>
       </w:r>
-      <w:bookmarkEnd w:id="216"/>
+      <w:bookmarkEnd w:id="217"/>
     </w:p>
     <w:tbl>
       <w:tblPr>
@@ -16321,6 +16715,62 @@
                 <w:rFonts w:ascii="Calibri" w:hAnsi="Calibri"/>
                 <w:sz w:val="18"/>
               </w:rPr>
+              <w:t>Download and validate Contra v2</w:t>
+            </w:r>
+          </w:p>
+        </w:tc>
+        <w:tc>
+          <w:tcPr>
+            <w:tcW w:type="dxa" w:w="6480"/>
+            <w:vAlign w:val="center"/>
+            <w:tcMar>
+              <w:top w:w="80" w:type="dxa"/>
+              <w:start w:w="100" w:type="dxa"/>
+              <w:bottom w:w="80" w:type="dxa"/>
+              <w:end w:w="100" w:type="dxa"/>
+            </w:tcMar>
+            <w:shd w:fill="F4F6F7"/>
+          </w:tcPr>
+          <w:p>
+            <w:pPr>
+              <w:spacing w:after="0"/>
+            </w:pPr>
+            <w:r>
+              <w:rPr>
+                <w:rFonts w:ascii="Calibri" w:hAnsi="Calibri"/>
+                <w:color w:val="1F4D78"/>
+                <w:sz w:val="18"/>
+              </w:rPr>
+              <w:t>.\.venv\Scripts\python.exe tools\download_huggingface_model.py</w:t>
+            </w:r>
+          </w:p>
+        </w:tc>
+      </w:tr>
+      <w:tr>
+        <w:trPr>
+          <w:cantSplit/>
+        </w:trPr>
+        <w:tc>
+          <w:tcPr>
+            <w:tcW w:type="dxa" w:w="2880"/>
+            <w:vAlign w:val="center"/>
+            <w:tcMar>
+              <w:top w:w="80" w:type="dxa"/>
+              <w:start w:w="100" w:type="dxa"/>
+              <w:bottom w:w="80" w:type="dxa"/>
+              <w:end w:w="100" w:type="dxa"/>
+            </w:tcMar>
+            <w:shd w:fill="FFFFFF"/>
+          </w:tcPr>
+          <w:p>
+            <w:pPr>
+              <w:spacing w:after="0"/>
+            </w:pPr>
+            <w:r>
+              <w:rPr>
+                <w:rFonts w:ascii="Calibri" w:hAnsi="Calibri"/>
+                <w:sz w:val="18"/>
+              </w:rPr>
               <w:t>Export notebook</w:t>
             </w:r>
           </w:p>
@@ -16335,7 +16785,7 @@
               <w:bottom w:w="80" w:type="dxa"/>
               <w:end w:w="100" w:type="dxa"/>
             </w:tcMar>
-            <w:shd w:fill="F4F6F7"/>
+            <w:shd w:fill="FFFFFF"/>
           </w:tcPr>
           <w:p>
             <w:pPr>
@@ -16366,7 +16816,7 @@
               <w:bottom w:w="80" w:type="dxa"/>
               <w:end w:w="100" w:type="dxa"/>
             </w:tcMar>
-            <w:shd w:fill="FFFFFF"/>
+            <w:shd w:fill="F4F6F7"/>
           </w:tcPr>
           <w:p>
             <w:pPr>
@@ -16391,7 +16841,7 @@
               <w:bottom w:w="80" w:type="dxa"/>
               <w:end w:w="100" w:type="dxa"/>
             </w:tcMar>
-            <w:shd w:fill="FFFFFF"/>
+            <w:shd w:fill="F4F6F7"/>
           </w:tcPr>
           <w:p>
             <w:pPr>
@@ -16422,7 +16872,7 @@
               <w:bottom w:w="80" w:type="dxa"/>
               <w:end w:w="100" w:type="dxa"/>
             </w:tcMar>
-            <w:shd w:fill="F4F6F7"/>
+            <w:shd w:fill="FFFFFF"/>
           </w:tcPr>
           <w:p>
             <w:pPr>
@@ -16447,7 +16897,7 @@
               <w:bottom w:w="80" w:type="dxa"/>
               <w:end w:w="100" w:type="dxa"/>
             </w:tcMar>
-            <w:shd w:fill="F4F6F7"/>
+            <w:shd w:fill="FFFFFF"/>
           </w:tcPr>
           <w:p>
             <w:pPr>
@@ -16478,7 +16928,7 @@
               <w:bottom w:w="80" w:type="dxa"/>
               <w:end w:w="100" w:type="dxa"/>
             </w:tcMar>
-            <w:shd w:fill="FFFFFF"/>
+            <w:shd w:fill="F4F6F7"/>
           </w:tcPr>
           <w:p>
             <w:pPr>
@@ -16503,7 +16953,7 @@
               <w:bottom w:w="80" w:type="dxa"/>
               <w:end w:w="100" w:type="dxa"/>
             </w:tcMar>
-            <w:shd w:fill="FFFFFF"/>
+            <w:shd w:fill="F4F6F7"/>
           </w:tcPr>
           <w:p>
             <w:pPr>
@@ -16534,7 +16984,7 @@
               <w:bottom w:w="80" w:type="dxa"/>
               <w:end w:w="100" w:type="dxa"/>
             </w:tcMar>
-            <w:shd w:fill="F4F6F7"/>
+            <w:shd w:fill="FFFFFF"/>
           </w:tcPr>
           <w:p>
             <w:pPr>
@@ -16559,7 +17009,7 @@
               <w:bottom w:w="80" w:type="dxa"/>
               <w:end w:w="100" w:type="dxa"/>
             </w:tcMar>
-            <w:shd w:fill="F4F6F7"/>
+            <w:shd w:fill="FFFFFF"/>
           </w:tcPr>
           <w:p>
             <w:pPr>
@@ -16610,14 +17060,14 @@
       </w:r>
     </w:p>
     <w:p>
-      <w:bookmarkStart w:id="217" w:name="guide_sec_118"/>
+      <w:bookmarkStart w:id="218" w:name="guide_sec_119"/>
       <w:pPr>
         <w:pStyle w:val="Heading2"/>
       </w:pPr>
       <w:r>
         <w:t>17.2 TrainingConfig fields</w:t>
       </w:r>
-      <w:bookmarkEnd w:id="217"/>
+      <w:bookmarkEnd w:id="218"/>
     </w:p>
     <w:tbl>
       <w:tblPr>
@@ -18229,14 +18679,14 @@
       </w:pPr>
     </w:p>
     <w:p>
-      <w:bookmarkStart w:id="218" w:name="guide_sec_119"/>
+      <w:bookmarkStart w:id="219" w:name="guide_sec_120"/>
       <w:pPr>
         <w:pStyle w:val="Heading2"/>
       </w:pPr>
       <w:r>
         <w:t>17.3 Glossary</w:t>
       </w:r>
-      <w:bookmarkEnd w:id="218"/>
+      <w:bookmarkEnd w:id="219"/>
     </w:p>
     <w:p>
       <w:r>
@@ -18349,14 +18799,14 @@
       </w:r>
     </w:p>
     <w:p>
-      <w:bookmarkStart w:id="219" w:name="guide_sec_120"/>
+      <w:bookmarkStart w:id="220" w:name="guide_sec_121"/>
       <w:pPr>
         <w:pStyle w:val="Heading2"/>
       </w:pPr>
       <w:r>
         <w:t>17.4 Final learning checklist</w:t>
       </w:r>
-      <w:bookmarkEnd w:id="219"/>
+      <w:bookmarkEnd w:id="220"/>
     </w:p>
     <w:p>
       <w:pPr>

</xml_diff>